<commit_message>
docs(day7): add written list of validation and duplicate rules to Day 7 report
</commit_message>
<xml_diff>
--- a/docs/reports/LogiQ_Day7_Progress_Report_Induja.docx
+++ b/docs/reports/LogiQ_Day7_Progress_Report_Induja.docx
@@ -28,7 +28,7 @@
           <w:color w:val="64748B"/>
           <w:sz w:val="22"/>
         </w:rPr>
-        <w:t>Jira Task KAN-7: Item Attributes, Multi-Tier Pricing, Lifecycle Status, Data Governance (Duplicate Locks &amp; Price Sanity), and Vendor Document Approval Engine</w:t>
+        <w:t>Jira Task KAN-7: Item Attributes, Multi-Tier Pricing, Lifecycle Status, Data Governance (Duplicate Locks &amp; Price Sanity Rules), and Vendor Document Approval Engine</w:t>
       </w:r>
     </w:p>
     <w:tbl>
@@ -315,7 +315,225 @@
           <w:color w:val="1E3A8A"/>
           <w:sz w:val="30"/>
         </w:rPr>
-        <w:t>2. Planned vs. Completed Work</w:t>
+        <w:t>2. Written List of Validation &amp; Duplicate Rules Implemented</w:t>
+      </w:r>
+    </w:p>
+    <w:p>
+      <w:pPr>
+        <w:spacing w:after="80"/>
+        <w:ind w:left="288"/>
+      </w:pPr>
+      <w:r>
+        <w:rPr>
+          <w:rFonts w:ascii="Calibri" w:hAnsi="Calibri"/>
+          <w:b/>
+          <w:color w:val="1E3A8A"/>
+          <w:sz w:val="20"/>
+        </w:rPr>
+        <w:t xml:space="preserve">• 1. Global Duplicate SKU Lock Rule: </w:t>
+      </w:r>
+      <w:r>
+        <w:rPr>
+          <w:rFonts w:ascii="Calibri" w:hAnsi="Calibri"/>
+          <w:sz w:val="20"/>
+        </w:rPr>
+        <w:t>SKU codes are sanitized (trim/uppercase). Creation or modification of any item with a SKU that already exists across the global catalog is strictly blocked on both POST and PUT endpoints (/api/mdm/items and /api/vendor/products).</w:t>
+      </w:r>
+    </w:p>
+    <w:p>
+      <w:pPr>
+        <w:spacing w:after="80"/>
+        <w:ind w:left="288"/>
+      </w:pPr>
+      <w:r>
+        <w:rPr>
+          <w:rFonts w:ascii="Calibri" w:hAnsi="Calibri"/>
+          <w:b/>
+          <w:color w:val="1E3A8A"/>
+          <w:sz w:val="20"/>
+        </w:rPr>
+        <w:t xml:space="preserve">• 2. Global Duplicate Barcode EAN-13 Lock Rule: </w:t>
+      </w:r>
+      <w:r>
+        <w:rPr>
+          <w:rFonts w:ascii="Calibri" w:hAnsi="Calibri"/>
+          <w:sz w:val="20"/>
+        </w:rPr>
+        <w:t>Barcodes are validated for GS1 13-digit format. Attempting to register or update an item with a barcode assigned to another item in the platform is strictly blocked.</w:t>
+      </w:r>
+    </w:p>
+    <w:p>
+      <w:pPr>
+        <w:spacing w:after="80"/>
+        <w:ind w:left="288"/>
+      </w:pPr>
+      <w:r>
+        <w:rPr>
+          <w:rFonts w:ascii="Calibri" w:hAnsi="Calibri"/>
+          <w:b/>
+          <w:color w:val="1E3A8A"/>
+          <w:sz w:val="20"/>
+        </w:rPr>
+        <w:t xml:space="preserve">• 3. Duplicate Item Name in Category Rule: </w:t>
+      </w:r>
+      <w:r>
+        <w:rPr>
+          <w:rFonts w:ascii="Calibri" w:hAnsi="Calibri"/>
+          <w:sz w:val="20"/>
+        </w:rPr>
+        <w:t>Registering two items with the exact same name within the same Category Taxonomy is blocked to prevent catalog clutter.</w:t>
+      </w:r>
+    </w:p>
+    <w:p>
+      <w:pPr>
+        <w:spacing w:after="80"/>
+        <w:ind w:left="288"/>
+      </w:pPr>
+      <w:r>
+        <w:rPr>
+          <w:rFonts w:ascii="Calibri" w:hAnsi="Calibri"/>
+          <w:b/>
+          <w:color w:val="1E3A8A"/>
+          <w:sz w:val="20"/>
+        </w:rPr>
+        <w:t xml:space="preserve">• 4. Price Sanity Rule 1 (Selling Price &gt;= Cost Price): </w:t>
+      </w:r>
+      <w:r>
+        <w:rPr>
+          <w:rFonts w:ascii="Calibri" w:hAnsi="Calibri"/>
+          <w:sz w:val="20"/>
+        </w:rPr>
+        <w:t>Retail Selling Price cannot be lower than Cost Price (sellingPrice &lt; costPrice is blocked on POST and PUT).</w:t>
+      </w:r>
+    </w:p>
+    <w:p>
+      <w:pPr>
+        <w:spacing w:after="80"/>
+        <w:ind w:left="288"/>
+      </w:pPr>
+      <w:r>
+        <w:rPr>
+          <w:rFonts w:ascii="Calibri" w:hAnsi="Calibri"/>
+          <w:b/>
+          <w:color w:val="1E3A8A"/>
+          <w:sz w:val="20"/>
+        </w:rPr>
+        <w:t xml:space="preserve">• 5. Price Sanity Rule 2 (Wholesale Price &lt;= Selling Price): </w:t>
+      </w:r>
+      <w:r>
+        <w:rPr>
+          <w:rFonts w:ascii="Calibri" w:hAnsi="Calibri"/>
+          <w:sz w:val="20"/>
+        </w:rPr>
+        <w:t>Wholesale tier price cannot exceed retail selling price (wholesalePrice &gt; sellingPrice is blocked on POST and PUT).</w:t>
+      </w:r>
+    </w:p>
+    <w:p>
+      <w:pPr>
+        <w:spacing w:after="80"/>
+        <w:ind w:left="288"/>
+      </w:pPr>
+      <w:r>
+        <w:rPr>
+          <w:rFonts w:ascii="Calibri" w:hAnsi="Calibri"/>
+          <w:b/>
+          <w:color w:val="1E3A8A"/>
+          <w:sz w:val="20"/>
+        </w:rPr>
+        <w:t xml:space="preserve">• 6. Australian ABN / ACN Format Validation Rule: </w:t>
+      </w:r>
+      <w:r>
+        <w:rPr>
+          <w:rFonts w:ascii="Calibri" w:hAnsi="Calibri"/>
+          <w:sz w:val="20"/>
+        </w:rPr>
+        <w:t>ABN must be exactly 11 numeric digits and ACN must be exactly 9 numeric digits. Invalid digit lengths or non-numeric characters are rejected.</w:t>
+      </w:r>
+    </w:p>
+    <w:p>
+      <w:pPr>
+        <w:spacing w:after="80"/>
+        <w:ind w:left="288"/>
+      </w:pPr>
+      <w:r>
+        <w:rPr>
+          <w:rFonts w:ascii="Calibri" w:hAnsi="Calibri"/>
+          <w:b/>
+          <w:color w:val="1E3A8A"/>
+          <w:sz w:val="20"/>
+        </w:rPr>
+        <w:t xml:space="preserve">• 7. Vendor Catalog Governance Lock Rule: </w:t>
+      </w:r>
+      <w:r>
+        <w:rPr>
+          <w:rFonts w:ascii="Calibri" w:hAnsi="Calibri"/>
+          <w:sz w:val="20"/>
+        </w:rPr>
+        <w:t>Vendor accounts with status PENDING, UNDER_REVIEW, SUSPENDED, or REJECTED are strictly blocked from adding or editing products until account status is APPROVED by ATO Governance.</w:t>
+      </w:r>
+    </w:p>
+    <w:p>
+      <w:pPr>
+        <w:spacing w:after="80"/>
+        <w:ind w:left="288"/>
+      </w:pPr>
+      <w:r>
+        <w:rPr>
+          <w:rFonts w:ascii="Calibri" w:hAnsi="Calibri"/>
+          <w:b/>
+          <w:color w:val="1E3A8A"/>
+          <w:sz w:val="20"/>
+        </w:rPr>
+        <w:t xml:space="preserve">• 8. Compliance File Format &amp; Size Rule: </w:t>
+      </w:r>
+      <w:r>
+        <w:rPr>
+          <w:rFonts w:ascii="Calibri" w:hAnsi="Calibri"/>
+          <w:sz w:val="20"/>
+        </w:rPr>
+        <w:t>Permitted document formats: .pdf, .png, .jpg, .jpeg, .doc, .docx. Executables (.exe, .zip) and files exceeding 5MB are rejected.</w:t>
+      </w:r>
+    </w:p>
+    <w:p>
+      <w:pPr>
+        <w:spacing w:after="80"/>
+        <w:ind w:left="288"/>
+      </w:pPr>
+      <w:r>
+        <w:rPr>
+          <w:rFonts w:ascii="Calibri" w:hAnsi="Calibri"/>
+          <w:b/>
+          <w:color w:val="1E3A8A"/>
+          <w:sz w:val="20"/>
+        </w:rPr>
+        <w:t xml:space="preserve">• 9. Minimum Order Quantity (MOQ) Rule: </w:t>
+      </w:r>
+      <w:r>
+        <w:rPr>
+          <w:rFonts w:ascii="Calibri" w:hAnsi="Calibri"/>
+          <w:sz w:val="20"/>
+        </w:rPr>
+        <w:t>MOQ must be an integer greater than or equal to 1 (moq &gt;= 1).</w:t>
+      </w:r>
+    </w:p>
+    <w:p>
+      <w:pPr>
+        <w:spacing w:after="120"/>
+      </w:pPr>
+    </w:p>
+    <w:p>
+      <w:pPr>
+        <w:pStyle w:val="Heading1"/>
+        <w:spacing w:before="280" w:after="120"/>
+      </w:pPr>
+      <w:r>
+        <w:rPr>
+          <w:rFonts w:ascii="Calibri" w:hAnsi="Calibri"/>
+          <w:b/>
+          <w:color w:val="1E3A8A"/>
+          <w:sz w:val="30"/>
+        </w:rPr>
+        <w:t>3. Planned vs. Completed Work</w:t>
       </w:r>
     </w:p>
     <w:tbl>
@@ -894,7 +1112,7 @@
           <w:color w:val="1E3A8A"/>
           <w:sz w:val="30"/>
         </w:rPr>
-        <w:t>3. Key Architectural &amp; Technical Decisions</w:t>
+        <w:t>4. Key Architectural &amp; Technical Decisions</w:t>
       </w:r>
     </w:p>
     <w:p>
@@ -997,7 +1215,7 @@
           <w:color w:val="1E3A8A"/>
           <w:sz w:val="30"/>
         </w:rPr>
-        <w:t>4. Blockers Identified &amp; Resolved</w:t>
+        <w:t>5. Blockers Identified &amp; Resolved</w:t>
       </w:r>
     </w:p>
     <w:p>
@@ -1046,7 +1264,7 @@
           <w:color w:val="1E3A8A"/>
           <w:sz w:val="30"/>
         </w:rPr>
-        <w:t>5. Open Bugs &amp; Technical Debt</w:t>
+        <w:t>6. Open Bugs &amp; Technical Debt</w:t>
       </w:r>
     </w:p>
     <w:p>
@@ -1072,7 +1290,7 @@
           <w:color w:val="1E3A8A"/>
           <w:sz w:val="30"/>
         </w:rPr>
-        <w:t>6. Tomorrow's Plan — Day 8 Execution Scope</w:t>
+        <w:t>7. Tomorrow's Plan — Day 8 Execution Scope</w:t>
       </w:r>
     </w:p>
     <w:p>

</xml_diff>